<commit_message>
stage 5: map + GameMap, Raylib-cs, Ui (button, text input, cyrillic font); spec: full Raylib client
</commit_message>
<xml_diff>
--- a/ТЗ «Призрак и охотники» — UDP.docx
+++ b/ТЗ «Призрак и охотники» — UDP.docx
@@ -87,7 +87,7 @@
         <w:spacing w:after="60"/>
       </w:pPr>
       <w:r>
-        <w:t xml:space="preserve">Подключение, лобби и комната работают в консоли клиента; окно Raylib-cs открывается на время раунда.</w:t>
+        <w:t xml:space="preserve">Клиент — одно окно Raylib-cs: подключение, лобби, комната, игра и итоги — экраны внутри него; кнопки и поля ввода сделаны вручную.</w:t>
       </w:r>
     </w:p>
     <w:p>
@@ -375,7 +375,7 @@
                 <w:sz w:val="20"/>
                 <w:szCs w:val="20"/>
               </w:rPr>
-              <w:t xml:space="preserve">консольный (подключение, лобби, комната) + окно Raylib-cs на время раунда</w:t>
+              <w:t xml:space="preserve">десктопное окно Raylib-cs: экраны подключения, лобби, комнаты, игры и итогов</w:t>
             </w:r>
           </w:p>
         </w:tc>
@@ -524,7 +524,7 @@
         <w:spacing w:after="120"/>
       </w:pPr>
       <w:r>
-        <w:t xml:space="preserve">Решение GhostGame состоит из трёх проектов: сервер и клиент — консольные приложения, общий код протокола и надёжного канала живёт в библиотеке GhostGame.Shared.</w:t>
+        <w:t xml:space="preserve">Решение GhostGame состоит из трёх проектов: сервер — консольное приложение, клиент — приложение с окном Raylib-cs, общий код протокола и надёжного канала живёт в библиотеке GhostGame.Shared.</w:t>
       </w:r>
     </w:p>
     <w:tbl>
@@ -688,7 +688,7 @@
                 <w:sz w:val="20"/>
                 <w:szCs w:val="20"/>
               </w:rPr>
-              <w:t xml:space="preserve">консольный клиент с окном Raylib-cs на время раунда: принимает датаграммы в фоновой задаче, повторяет неподтверждённые надёжные пакеты, рисует последний Snapshot</w:t>
+              <w:t xml:space="preserve">окно Raylib-cs с экранами подключения, лобби, комнаты, игры и итогов: принимает датаграммы в фоновой задаче, повторяет неподтверждённые надёжные пакеты, рисует последний Snapshot</w:t>
             </w:r>
           </w:p>
         </w:tc>
@@ -2752,7 +2752,7 @@
                 <w:sz w:val="20"/>
                 <w:szCs w:val="20"/>
               </w:rPr>
-              <w:t xml:space="preserve">команда «список комнат»</w:t>
+              <w:t xml:space="preserve">открыт экран лобби, кнопка «Обновить»</w:t>
             </w:r>
           </w:p>
         </w:tc>
@@ -2867,7 +2867,7 @@
                 <w:sz w:val="20"/>
                 <w:szCs w:val="20"/>
               </w:rPr>
-              <w:t xml:space="preserve">команда «создать комнату»</w:t>
+              <w:t xml:space="preserve">кнопка «Создать комнату»</w:t>
             </w:r>
           </w:p>
         </w:tc>
@@ -3212,7 +3212,7 @@
                 <w:sz w:val="20"/>
                 <w:szCs w:val="20"/>
               </w:rPr>
-              <w:t xml:space="preserve">команда «готов» / «не готов»</w:t>
+              <w:t xml:space="preserve">кнопка «Готов» / «Не готов»</w:t>
             </w:r>
           </w:p>
         </w:tc>
@@ -5954,7 +5954,7 @@
         <w:spacing w:after="120"/>
       </w:pPr>
       <w:r>
-        <w:t xml:space="preserve">Клиент — консольное приложение. Подключение, лобби и комната работают в консоли. На время раунда открывается окно 1280×800 на Raylib-cs; после конца раунда окно закрывается, итоги выводятся в консоль. Клиент только рисует последний Snapshot и шлёт нажатия, ничего не решая сам. Адрес и порт сервера задаются аргументами запуска.</w:t>
+        <w:t xml:space="preserve">Клиент — окно 1280×800 на Raylib-cs. Окно открывается при запуске программы и закрывается при выходе; подключение, лобби, комната, игра и итоги — экраны внутри него, в каждый момент рисуется один. Клиент только рисует последний Snapshot и шлёт нажатия, ничего не решая сам. Адрес и порт сервера задаются аргументами запуска.</w:t>
       </w:r>
     </w:p>
     <w:p>
@@ -5978,10 +5978,9 @@
         </w:tblBorders>
       </w:tblPr>
       <w:tblGrid>
-        <w:gridCol w:w="1700"/>
-        <w:gridCol w:w="1100"/>
-        <w:gridCol w:w="3760"/>
-        <w:gridCol w:w="2800"/>
+        <w:gridCol w:w="1900"/>
+        <w:gridCol w:w="4460"/>
+        <w:gridCol w:w="3000"/>
       </w:tblGrid>
       <w:tr>
         <w:trPr>
@@ -5990,7 +5989,7 @@
         </w:trPr>
         <w:tc>
           <w:tcPr>
-            <w:tcW w:type="dxa" w:w="1700"/>
+            <w:tcW w:type="dxa" w:w="1900"/>
             <w:shd w:fill="F2F2F2" w:color="auto" w:val="clear"/>
             <w:tcMar>
               <w:top w:type="dxa" w:w="60"/>
@@ -6013,7 +6012,7 @@
         </w:tc>
         <w:tc>
           <w:tcPr>
-            <w:tcW w:type="dxa" w:w="1100"/>
+            <w:tcW w:type="dxa" w:w="4460"/>
             <w:shd w:fill="F2F2F2" w:color="auto" w:val="clear"/>
             <w:tcMar>
               <w:top w:type="dxa" w:w="60"/>
@@ -6030,36 +6029,13 @@
                 <w:sz w:val="20"/>
                 <w:szCs w:val="20"/>
               </w:rPr>
-              <w:t xml:space="preserve">Где</w:t>
-            </w:r>
-          </w:p>
-        </w:tc>
-        <w:tc>
-          <w:tcPr>
-            <w:tcW w:type="dxa" w:w="3760"/>
-            <w:shd w:fill="F2F2F2" w:color="auto" w:val="clear"/>
-            <w:tcMar>
-              <w:top w:type="dxa" w:w="60"/>
-              <w:left w:type="dxa" w:w="100"/>
-              <w:bottom w:type="dxa" w:w="60"/>
-              <w:right w:type="dxa" w:w="100"/>
-            </w:tcMar>
-          </w:tcPr>
-          <w:p>
-            <w:r>
-              <w:rPr>
-                <w:b/>
-                <w:bCs/>
-                <w:sz w:val="20"/>
-                <w:szCs w:val="20"/>
-              </w:rPr>
               <w:t xml:space="preserve">Что на нём</w:t>
             </w:r>
           </w:p>
         </w:tc>
         <w:tc>
           <w:tcPr>
-            <w:tcW w:type="dxa" w:w="2800"/>
+            <w:tcW w:type="dxa" w:w="3000"/>
             <w:shd w:fill="F2F2F2" w:color="auto" w:val="clear"/>
             <w:tcMar>
               <w:top w:type="dxa" w:w="60"/>
@@ -6087,7 +6063,7 @@
         </w:trPr>
         <w:tc>
           <w:tcPr>
-            <w:tcW w:type="dxa" w:w="1700"/>
+            <w:tcW w:type="dxa" w:w="1900"/>
             <w:tcMar>
               <w:top w:type="dxa" w:w="60"/>
               <w:left w:type="dxa" w:w="100"/>
@@ -6109,51 +6085,29 @@
         </w:tc>
         <w:tc>
           <w:tcPr>
-            <w:tcW w:type="dxa" w:w="1100"/>
-            <w:tcMar>
-              <w:top w:type="dxa" w:w="60"/>
-              <w:left w:type="dxa" w:w="100"/>
-              <w:bottom w:type="dxa" w:w="60"/>
-              <w:right w:type="dxa" w:w="100"/>
-            </w:tcMar>
-          </w:tcPr>
-          <w:p>
-            <w:r>
-              <w:rPr>
-                <w:b w:val="false"/>
-                <w:bCs w:val="false"/>
-                <w:sz w:val="20"/>
-                <w:szCs w:val="20"/>
-              </w:rPr>
-              <w:t xml:space="preserve">консоль</w:t>
-            </w:r>
-          </w:p>
-        </w:tc>
-        <w:tc>
-          <w:tcPr>
-            <w:tcW w:type="dxa" w:w="3760"/>
-            <w:tcMar>
-              <w:top w:type="dxa" w:w="60"/>
-              <w:left w:type="dxa" w:w="100"/>
-              <w:bottom w:type="dxa" w:w="60"/>
-              <w:right w:type="dxa" w:w="100"/>
-            </w:tcMar>
-          </w:tcPr>
-          <w:p>
-            <w:r>
-              <w:rPr>
-                <w:b w:val="false"/>
-                <w:bCs w:val="false"/>
-                <w:sz w:val="20"/>
-                <w:szCs w:val="20"/>
-              </w:rPr>
-              <w:t xml:space="preserve">ввод ника, текст ошибки, «Сервер не отвечает»</w:t>
-            </w:r>
-          </w:p>
-        </w:tc>
-        <w:tc>
-          <w:tcPr>
-            <w:tcW w:type="dxa" w:w="2800"/>
+            <w:tcW w:type="dxa" w:w="4460"/>
+            <w:tcMar>
+              <w:top w:type="dxa" w:w="60"/>
+              <w:left w:type="dxa" w:w="100"/>
+              <w:bottom w:type="dxa" w:w="60"/>
+              <w:right w:type="dxa" w:w="100"/>
+            </w:tcMar>
+          </w:tcPr>
+          <w:p>
+            <w:r>
+              <w:rPr>
+                <w:b w:val="false"/>
+                <w:bCs w:val="false"/>
+                <w:sz w:val="20"/>
+                <w:szCs w:val="20"/>
+              </w:rPr>
+              <w:t xml:space="preserve">поле «ник», кнопка «Войти», текст ошибки, «Сервер не отвечает»</w:t>
+            </w:r>
+          </w:p>
+        </w:tc>
+        <w:tc>
+          <w:tcPr>
+            <w:tcW w:type="dxa" w:w="3000"/>
             <w:tcMar>
               <w:top w:type="dxa" w:w="60"/>
               <w:left w:type="dxa" w:w="100"/>
@@ -6180,7 +6134,7 @@
         </w:trPr>
         <w:tc>
           <w:tcPr>
-            <w:tcW w:type="dxa" w:w="1700"/>
+            <w:tcW w:type="dxa" w:w="1900"/>
             <w:tcMar>
               <w:top w:type="dxa" w:w="60"/>
               <w:left w:type="dxa" w:w="100"/>
@@ -6202,51 +6156,29 @@
         </w:tc>
         <w:tc>
           <w:tcPr>
-            <w:tcW w:type="dxa" w:w="1100"/>
-            <w:tcMar>
-              <w:top w:type="dxa" w:w="60"/>
-              <w:left w:type="dxa" w:w="100"/>
-              <w:bottom w:type="dxa" w:w="60"/>
-              <w:right w:type="dxa" w:w="100"/>
-            </w:tcMar>
-          </w:tcPr>
-          <w:p>
-            <w:r>
-              <w:rPr>
-                <w:b w:val="false"/>
-                <w:bCs w:val="false"/>
-                <w:sz w:val="20"/>
-                <w:szCs w:val="20"/>
-              </w:rPr>
-              <w:t xml:space="preserve">консоль</w:t>
-            </w:r>
-          </w:p>
-        </w:tc>
-        <w:tc>
-          <w:tcPr>
-            <w:tcW w:type="dxa" w:w="3760"/>
-            <w:tcMar>
-              <w:top w:type="dxa" w:w="60"/>
-              <w:left w:type="dxa" w:w="100"/>
-              <w:bottom w:type="dxa" w:w="60"/>
-              <w:right w:type="dxa" w:w="100"/>
-            </w:tcMar>
-          </w:tcPr>
-          <w:p>
-            <w:r>
-              <w:rPr>
-                <w:b w:val="false"/>
-                <w:bCs w:val="false"/>
-                <w:sz w:val="20"/>
-                <w:szCs w:val="20"/>
-              </w:rPr>
-              <w:t xml:space="preserve">список комнат, команды создать / войти / обновить, пинг</w:t>
-            </w:r>
-          </w:p>
-        </w:tc>
-        <w:tc>
-          <w:tcPr>
-            <w:tcW w:type="dxa" w:w="2800"/>
+            <w:tcW w:type="dxa" w:w="4460"/>
+            <w:tcMar>
+              <w:top w:type="dxa" w:w="60"/>
+              <w:left w:type="dxa" w:w="100"/>
+              <w:bottom w:type="dxa" w:w="60"/>
+              <w:right w:type="dxa" w:w="100"/>
+            </w:tcMar>
+          </w:tcPr>
+          <w:p>
+            <w:r>
+              <w:rPr>
+                <w:b w:val="false"/>
+                <w:bCs w:val="false"/>
+                <w:sz w:val="20"/>
+                <w:szCs w:val="20"/>
+              </w:rPr>
+              <w:t xml:space="preserve">список комнат (клик по комнате — войти), поле названия и кнопка «Создать», кнопка «Обновить», пинг до сервера</w:t>
+            </w:r>
+          </w:p>
+        </w:tc>
+        <w:tc>
+          <w:tcPr>
+            <w:tcW w:type="dxa" w:w="3000"/>
             <w:tcMar>
               <w:top w:type="dxa" w:w="60"/>
               <w:left w:type="dxa" w:w="100"/>
@@ -6273,7 +6205,7 @@
         </w:trPr>
         <w:tc>
           <w:tcPr>
-            <w:tcW w:type="dxa" w:w="1700"/>
+            <w:tcW w:type="dxa" w:w="1900"/>
             <w:tcMar>
               <w:top w:type="dxa" w:w="60"/>
               <w:left w:type="dxa" w:w="100"/>
@@ -6295,51 +6227,29 @@
         </w:tc>
         <w:tc>
           <w:tcPr>
-            <w:tcW w:type="dxa" w:w="1100"/>
-            <w:tcMar>
-              <w:top w:type="dxa" w:w="60"/>
-              <w:left w:type="dxa" w:w="100"/>
-              <w:bottom w:type="dxa" w:w="60"/>
-              <w:right w:type="dxa" w:w="100"/>
-            </w:tcMar>
-          </w:tcPr>
-          <w:p>
-            <w:r>
-              <w:rPr>
-                <w:b w:val="false"/>
-                <w:bCs w:val="false"/>
-                <w:sz w:val="20"/>
-                <w:szCs w:val="20"/>
-              </w:rPr>
-              <w:t xml:space="preserve">консоль</w:t>
-            </w:r>
-          </w:p>
-        </w:tc>
-        <w:tc>
-          <w:tcPr>
-            <w:tcW w:type="dxa" w:w="3760"/>
-            <w:tcMar>
-              <w:top w:type="dxa" w:w="60"/>
-              <w:left w:type="dxa" w:w="100"/>
-              <w:bottom w:type="dxa" w:w="60"/>
-              <w:right w:type="dxa" w:w="100"/>
-            </w:tcMar>
-          </w:tcPr>
-          <w:p>
-            <w:r>
-              <w:rPr>
-                <w:b w:val="false"/>
-                <w:bCs w:val="false"/>
-                <w:sz w:val="20"/>
-                <w:szCs w:val="20"/>
-              </w:rPr>
-              <w:t xml:space="preserve">игроки и их готовность, чат, команды «готов» и «выйти»</w:t>
-            </w:r>
-          </w:p>
-        </w:tc>
-        <w:tc>
-          <w:tcPr>
-            <w:tcW w:type="dxa" w:w="2800"/>
+            <w:tcW w:type="dxa" w:w="4460"/>
+            <w:tcMar>
+              <w:top w:type="dxa" w:w="60"/>
+              <w:left w:type="dxa" w:w="100"/>
+              <w:bottom w:type="dxa" w:w="60"/>
+              <w:right w:type="dxa" w:w="100"/>
+            </w:tcMar>
+          </w:tcPr>
+          <w:p>
+            <w:r>
+              <w:rPr>
+                <w:b w:val="false"/>
+                <w:bCs w:val="false"/>
+                <w:sz w:val="20"/>
+                <w:szCs w:val="20"/>
+              </w:rPr>
+              <w:t xml:space="preserve">игроки, их готовность и хост; кнопки «Готов» и «Выйти»; чат: последние сообщения и поле ввода</w:t>
+            </w:r>
+          </w:p>
+        </w:tc>
+        <w:tc>
+          <w:tcPr>
+            <w:tcW w:type="dxa" w:w="3000"/>
             <w:tcMar>
               <w:top w:type="dxa" w:w="60"/>
               <w:left w:type="dxa" w:w="100"/>
@@ -6366,7 +6276,7 @@
         </w:trPr>
         <w:tc>
           <w:tcPr>
-            <w:tcW w:type="dxa" w:w="1700"/>
+            <w:tcW w:type="dxa" w:w="1900"/>
             <w:tcMar>
               <w:top w:type="dxa" w:w="60"/>
               <w:left w:type="dxa" w:w="100"/>
@@ -6388,29 +6298,7 @@
         </w:tc>
         <w:tc>
           <w:tcPr>
-            <w:tcW w:type="dxa" w:w="1100"/>
-            <w:tcMar>
-              <w:top w:type="dxa" w:w="60"/>
-              <w:left w:type="dxa" w:w="100"/>
-              <w:bottom w:type="dxa" w:w="60"/>
-              <w:right w:type="dxa" w:w="100"/>
-            </w:tcMar>
-          </w:tcPr>
-          <w:p>
-            <w:r>
-              <w:rPr>
-                <w:b w:val="false"/>
-                <w:bCs w:val="false"/>
-                <w:sz w:val="20"/>
-                <w:szCs w:val="20"/>
-              </w:rPr>
-              <w:t xml:space="preserve">окно</w:t>
-            </w:r>
-          </w:p>
-        </w:tc>
-        <w:tc>
-          <w:tcPr>
-            <w:tcW w:type="dxa" w:w="3760"/>
+            <w:tcW w:type="dxa" w:w="4460"/>
             <w:tcMar>
               <w:top w:type="dxa" w:w="60"/>
               <w:left w:type="dxa" w:w="100"/>
@@ -6432,7 +6320,7 @@
         </w:tc>
         <w:tc>
           <w:tcPr>
-            <w:tcW w:type="dxa" w:w="2800"/>
+            <w:tcW w:type="dxa" w:w="3000"/>
             <w:tcMar>
               <w:top w:type="dxa" w:w="60"/>
               <w:left w:type="dxa" w:w="100"/>
@@ -6459,7 +6347,7 @@
         </w:trPr>
         <w:tc>
           <w:tcPr>
-            <w:tcW w:type="dxa" w:w="1700"/>
+            <w:tcW w:type="dxa" w:w="1900"/>
             <w:tcMar>
               <w:top w:type="dxa" w:w="60"/>
               <w:left w:type="dxa" w:w="100"/>
@@ -6481,29 +6369,7 @@
         </w:tc>
         <w:tc>
           <w:tcPr>
-            <w:tcW w:type="dxa" w:w="1100"/>
-            <w:tcMar>
-              <w:top w:type="dxa" w:w="60"/>
-              <w:left w:type="dxa" w:w="100"/>
-              <w:bottom w:type="dxa" w:w="60"/>
-              <w:right w:type="dxa" w:w="100"/>
-            </w:tcMar>
-          </w:tcPr>
-          <w:p>
-            <w:r>
-              <w:rPr>
-                <w:b w:val="false"/>
-                <w:bCs w:val="false"/>
-                <w:sz w:val="20"/>
-                <w:szCs w:val="20"/>
-              </w:rPr>
-              <w:t xml:space="preserve">окно</w:t>
-            </w:r>
-          </w:p>
-        </w:tc>
-        <w:tc>
-          <w:tcPr>
-            <w:tcW w:type="dxa" w:w="3760"/>
+            <w:tcW w:type="dxa" w:w="4460"/>
             <w:tcMar>
               <w:top w:type="dxa" w:w="60"/>
               <w:left w:type="dxa" w:w="100"/>
@@ -6525,7 +6391,7 @@
         </w:tc>
         <w:tc>
           <w:tcPr>
-            <w:tcW w:type="dxa" w:w="2800"/>
+            <w:tcW w:type="dxa" w:w="3000"/>
             <w:tcMar>
               <w:top w:type="dxa" w:w="60"/>
               <w:left w:type="dxa" w:w="100"/>
@@ -6552,7 +6418,7 @@
         </w:trPr>
         <w:tc>
           <w:tcPr>
-            <w:tcW w:type="dxa" w:w="1700"/>
+            <w:tcW w:type="dxa" w:w="1900"/>
             <w:tcMar>
               <w:top w:type="dxa" w:w="60"/>
               <w:left w:type="dxa" w:w="100"/>
@@ -6574,51 +6440,29 @@
         </w:tc>
         <w:tc>
           <w:tcPr>
-            <w:tcW w:type="dxa" w:w="1100"/>
-            <w:tcMar>
-              <w:top w:type="dxa" w:w="60"/>
-              <w:left w:type="dxa" w:w="100"/>
-              <w:bottom w:type="dxa" w:w="60"/>
-              <w:right w:type="dxa" w:w="100"/>
-            </w:tcMar>
-          </w:tcPr>
-          <w:p>
-            <w:r>
-              <w:rPr>
-                <w:b w:val="false"/>
-                <w:bCs w:val="false"/>
-                <w:sz w:val="20"/>
-                <w:szCs w:val="20"/>
-              </w:rPr>
-              <w:t xml:space="preserve">консоль</w:t>
-            </w:r>
-          </w:p>
-        </w:tc>
-        <w:tc>
-          <w:tcPr>
-            <w:tcW w:type="dxa" w:w="3760"/>
-            <w:tcMar>
-              <w:top w:type="dxa" w:w="60"/>
-              <w:left w:type="dxa" w:w="100"/>
-              <w:bottom w:type="dxa" w:w="60"/>
-              <w:right w:type="dxa" w:w="100"/>
-            </w:tcMar>
-          </w:tcPr>
-          <w:p>
-            <w:r>
-              <w:rPr>
-                <w:b w:val="false"/>
-                <w:bCs w:val="false"/>
-                <w:sz w:val="20"/>
-                <w:szCs w:val="20"/>
-              </w:rPr>
-              <w:t xml:space="preserve">победитель, причина, игроки и их роли</w:t>
-            </w:r>
-          </w:p>
-        </w:tc>
-        <w:tc>
-          <w:tcPr>
-            <w:tcW w:type="dxa" w:w="2800"/>
+            <w:tcW w:type="dxa" w:w="4460"/>
+            <w:tcMar>
+              <w:top w:type="dxa" w:w="60"/>
+              <w:left w:type="dxa" w:w="100"/>
+              <w:bottom w:type="dxa" w:w="60"/>
+              <w:right w:type="dxa" w:w="100"/>
+            </w:tcMar>
+          </w:tcPr>
+          <w:p>
+            <w:r>
+              <w:rPr>
+                <w:b w:val="false"/>
+                <w:bCs w:val="false"/>
+                <w:sz w:val="20"/>
+                <w:szCs w:val="20"/>
+              </w:rPr>
+              <w:t xml:space="preserve">победитель, причина, игроки и их роли, кнопка «В комнату»</w:t>
+            </w:r>
+          </w:p>
+        </w:tc>
+        <w:tc>
+          <w:tcPr>
+            <w:tcW w:type="dxa" w:w="3000"/>
             <w:tcMar>
               <w:top w:type="dxa" w:w="60"/>
               <w:left w:type="dxa" w:w="100"/>
@@ -6658,481 +6502,15 @@
         <w:spacing w:after="120"/>
       </w:pPr>
       <w:r>
-        <w:t xml:space="preserve">В консоли:</w:t>
-      </w:r>
-    </w:p>
-    <w:tbl>
-      <w:tblPr>
-        <w:tblW w:type="dxa" w:w="9360"/>
-        <w:tblBorders>
-          <w:top w:val="single" w:color="auto" w:sz="4"/>
-          <w:left w:val="single" w:color="auto" w:sz="4"/>
-          <w:bottom w:val="single" w:color="auto" w:sz="4"/>
-          <w:right w:val="single" w:color="auto" w:sz="4"/>
-          <w:insideH w:val="single" w:color="auto" w:sz="4"/>
-          <w:insideV w:val="single" w:color="auto" w:sz="4"/>
-        </w:tblBorders>
-      </w:tblPr>
-      <w:tblGrid>
-        <w:gridCol w:w="3000"/>
-        <w:gridCol w:w="6360"/>
-      </w:tblGrid>
-      <w:tr>
-        <w:trPr>
-          <w:cantSplit/>
-          <w:tblHeader/>
-        </w:trPr>
-        <w:tc>
-          <w:tcPr>
-            <w:tcW w:type="dxa" w:w="3000"/>
-            <w:shd w:fill="F2F2F2" w:color="auto" w:val="clear"/>
-            <w:tcMar>
-              <w:top w:type="dxa" w:w="60"/>
-              <w:left w:type="dxa" w:w="100"/>
-              <w:bottom w:type="dxa" w:w="60"/>
-              <w:right w:type="dxa" w:w="100"/>
-            </w:tcMar>
-          </w:tcPr>
-          <w:p>
-            <w:r>
-              <w:rPr>
-                <w:b/>
-                <w:bCs/>
-                <w:sz w:val="20"/>
-                <w:szCs w:val="20"/>
-              </w:rPr>
-              <w:t xml:space="preserve">Команда</w:t>
-            </w:r>
-          </w:p>
-        </w:tc>
-        <w:tc>
-          <w:tcPr>
-            <w:tcW w:type="dxa" w:w="6360"/>
-            <w:shd w:fill="F2F2F2" w:color="auto" w:val="clear"/>
-            <w:tcMar>
-              <w:top w:type="dxa" w:w="60"/>
-              <w:left w:type="dxa" w:w="100"/>
-              <w:bottom w:type="dxa" w:w="60"/>
-              <w:right w:type="dxa" w:w="100"/>
-            </w:tcMar>
-          </w:tcPr>
-          <w:p>
-            <w:r>
-              <w:rPr>
-                <w:b/>
-                <w:bCs/>
-                <w:sz w:val="20"/>
-                <w:szCs w:val="20"/>
-              </w:rPr>
-              <w:t xml:space="preserve">Действие</w:t>
-            </w:r>
-          </w:p>
-        </w:tc>
-      </w:tr>
-      <w:tr>
-        <w:trPr>
-          <w:cantSplit/>
-        </w:trPr>
-        <w:tc>
-          <w:tcPr>
-            <w:tcW w:type="dxa" w:w="3000"/>
-            <w:tcMar>
-              <w:top w:type="dxa" w:w="60"/>
-              <w:left w:type="dxa" w:w="100"/>
-              <w:bottom w:type="dxa" w:w="60"/>
-              <w:right w:type="dxa" w:w="100"/>
-            </w:tcMar>
-          </w:tcPr>
-          <w:p>
-            <w:r>
-              <w:rPr>
-                <w:b w:val="false"/>
-                <w:bCs w:val="false"/>
-                <w:sz w:val="20"/>
-                <w:szCs w:val="20"/>
-              </w:rPr>
-              <w:t xml:space="preserve">/rooms</w:t>
-            </w:r>
-          </w:p>
-        </w:tc>
-        <w:tc>
-          <w:tcPr>
-            <w:tcW w:type="dxa" w:w="6360"/>
-            <w:tcMar>
-              <w:top w:type="dxa" w:w="60"/>
-              <w:left w:type="dxa" w:w="100"/>
-              <w:bottom w:type="dxa" w:w="60"/>
-              <w:right w:type="dxa" w:w="100"/>
-            </w:tcMar>
-          </w:tcPr>
-          <w:p>
-            <w:r>
-              <w:rPr>
-                <w:b w:val="false"/>
-                <w:bCs w:val="false"/>
-                <w:sz w:val="20"/>
-                <w:szCs w:val="20"/>
-              </w:rPr>
-              <w:t xml:space="preserve">список комнат</w:t>
-            </w:r>
-          </w:p>
-        </w:tc>
-      </w:tr>
-      <w:tr>
-        <w:trPr>
-          <w:cantSplit/>
-        </w:trPr>
-        <w:tc>
-          <w:tcPr>
-            <w:tcW w:type="dxa" w:w="3000"/>
-            <w:tcMar>
-              <w:top w:type="dxa" w:w="60"/>
-              <w:left w:type="dxa" w:w="100"/>
-              <w:bottom w:type="dxa" w:w="60"/>
-              <w:right w:type="dxa" w:w="100"/>
-            </w:tcMar>
-          </w:tcPr>
-          <w:p>
-            <w:r>
-              <w:rPr>
-                <w:b w:val="false"/>
-                <w:bCs w:val="false"/>
-                <w:sz w:val="20"/>
-                <w:szCs w:val="20"/>
-              </w:rPr>
-              <w:t xml:space="preserve">/create &lt;название&gt;</w:t>
-            </w:r>
-          </w:p>
-        </w:tc>
-        <w:tc>
-          <w:tcPr>
-            <w:tcW w:type="dxa" w:w="6360"/>
-            <w:tcMar>
-              <w:top w:type="dxa" w:w="60"/>
-              <w:left w:type="dxa" w:w="100"/>
-              <w:bottom w:type="dxa" w:w="60"/>
-              <w:right w:type="dxa" w:w="100"/>
-            </w:tcMar>
-          </w:tcPr>
-          <w:p>
-            <w:r>
-              <w:rPr>
-                <w:b w:val="false"/>
-                <w:bCs w:val="false"/>
-                <w:sz w:val="20"/>
-                <w:szCs w:val="20"/>
-              </w:rPr>
-              <w:t xml:space="preserve">создать комнату и войти в неё</w:t>
-            </w:r>
-          </w:p>
-        </w:tc>
-      </w:tr>
-      <w:tr>
-        <w:trPr>
-          <w:cantSplit/>
-        </w:trPr>
-        <w:tc>
-          <w:tcPr>
-            <w:tcW w:type="dxa" w:w="3000"/>
-            <w:tcMar>
-              <w:top w:type="dxa" w:w="60"/>
-              <w:left w:type="dxa" w:w="100"/>
-              <w:bottom w:type="dxa" w:w="60"/>
-              <w:right w:type="dxa" w:w="100"/>
-            </w:tcMar>
-          </w:tcPr>
-          <w:p>
-            <w:r>
-              <w:rPr>
-                <w:b w:val="false"/>
-                <w:bCs w:val="false"/>
-                <w:sz w:val="20"/>
-                <w:szCs w:val="20"/>
-              </w:rPr>
-              <w:t xml:space="preserve">/join &lt;номер&gt;</w:t>
-            </w:r>
-          </w:p>
-        </w:tc>
-        <w:tc>
-          <w:tcPr>
-            <w:tcW w:type="dxa" w:w="6360"/>
-            <w:tcMar>
-              <w:top w:type="dxa" w:w="60"/>
-              <w:left w:type="dxa" w:w="100"/>
-              <w:bottom w:type="dxa" w:w="60"/>
-              <w:right w:type="dxa" w:w="100"/>
-            </w:tcMar>
-          </w:tcPr>
-          <w:p>
-            <w:r>
-              <w:rPr>
-                <w:b w:val="false"/>
-                <w:bCs w:val="false"/>
-                <w:sz w:val="20"/>
-                <w:szCs w:val="20"/>
-              </w:rPr>
-              <w:t xml:space="preserve">войти в комнату</w:t>
-            </w:r>
-          </w:p>
-        </w:tc>
-      </w:tr>
-      <w:tr>
-        <w:trPr>
-          <w:cantSplit/>
-        </w:trPr>
-        <w:tc>
-          <w:tcPr>
-            <w:tcW w:type="dxa" w:w="3000"/>
-            <w:tcMar>
-              <w:top w:type="dxa" w:w="60"/>
-              <w:left w:type="dxa" w:w="100"/>
-              <w:bottom w:type="dxa" w:w="60"/>
-              <w:right w:type="dxa" w:w="100"/>
-            </w:tcMar>
-          </w:tcPr>
-          <w:p>
-            <w:r>
-              <w:rPr>
-                <w:b w:val="false"/>
-                <w:bCs w:val="false"/>
-                <w:sz w:val="20"/>
-                <w:szCs w:val="20"/>
-              </w:rPr>
-              <w:t xml:space="preserve">/leave</w:t>
-            </w:r>
-          </w:p>
-        </w:tc>
-        <w:tc>
-          <w:tcPr>
-            <w:tcW w:type="dxa" w:w="6360"/>
-            <w:tcMar>
-              <w:top w:type="dxa" w:w="60"/>
-              <w:left w:type="dxa" w:w="100"/>
-              <w:bottom w:type="dxa" w:w="60"/>
-              <w:right w:type="dxa" w:w="100"/>
-            </w:tcMar>
-          </w:tcPr>
-          <w:p>
-            <w:r>
-              <w:rPr>
-                <w:b w:val="false"/>
-                <w:bCs w:val="false"/>
-                <w:sz w:val="20"/>
-                <w:szCs w:val="20"/>
-              </w:rPr>
-              <w:t xml:space="preserve">выйти из комнаты</w:t>
-            </w:r>
-          </w:p>
-        </w:tc>
-      </w:tr>
-      <w:tr>
-        <w:trPr>
-          <w:cantSplit/>
-        </w:trPr>
-        <w:tc>
-          <w:tcPr>
-            <w:tcW w:type="dxa" w:w="3000"/>
-            <w:tcMar>
-              <w:top w:type="dxa" w:w="60"/>
-              <w:left w:type="dxa" w:w="100"/>
-              <w:bottom w:type="dxa" w:w="60"/>
-              <w:right w:type="dxa" w:w="100"/>
-            </w:tcMar>
-          </w:tcPr>
-          <w:p>
-            <w:r>
-              <w:rPr>
-                <w:b w:val="false"/>
-                <w:bCs w:val="false"/>
-                <w:sz w:val="20"/>
-                <w:szCs w:val="20"/>
-              </w:rPr>
-              <w:t xml:space="preserve">/ready</w:t>
-            </w:r>
-          </w:p>
-        </w:tc>
-        <w:tc>
-          <w:tcPr>
-            <w:tcW w:type="dxa" w:w="6360"/>
-            <w:tcMar>
-              <w:top w:type="dxa" w:w="60"/>
-              <w:left w:type="dxa" w:w="100"/>
-              <w:bottom w:type="dxa" w:w="60"/>
-              <w:right w:type="dxa" w:w="100"/>
-            </w:tcMar>
-          </w:tcPr>
-          <w:p>
-            <w:r>
-              <w:rPr>
-                <w:b w:val="false"/>
-                <w:bCs w:val="false"/>
-                <w:sz w:val="20"/>
-                <w:szCs w:val="20"/>
-              </w:rPr>
-              <w:t xml:space="preserve">готов / не готов</w:t>
-            </w:r>
-          </w:p>
-        </w:tc>
-      </w:tr>
-      <w:tr>
-        <w:trPr>
-          <w:cantSplit/>
-        </w:trPr>
-        <w:tc>
-          <w:tcPr>
-            <w:tcW w:type="dxa" w:w="3000"/>
-            <w:tcMar>
-              <w:top w:type="dxa" w:w="60"/>
-              <w:left w:type="dxa" w:w="100"/>
-              <w:bottom w:type="dxa" w:w="60"/>
-              <w:right w:type="dxa" w:w="100"/>
-            </w:tcMar>
-          </w:tcPr>
-          <w:p>
-            <w:r>
-              <w:rPr>
-                <w:b w:val="false"/>
-                <w:bCs w:val="false"/>
-                <w:sz w:val="20"/>
-                <w:szCs w:val="20"/>
-              </w:rPr>
-              <w:t xml:space="preserve">/ping</w:t>
-            </w:r>
-          </w:p>
-        </w:tc>
-        <w:tc>
-          <w:tcPr>
-            <w:tcW w:type="dxa" w:w="6360"/>
-            <w:tcMar>
-              <w:top w:type="dxa" w:w="60"/>
-              <w:left w:type="dxa" w:w="100"/>
-              <w:bottom w:type="dxa" w:w="60"/>
-              <w:right w:type="dxa" w:w="100"/>
-            </w:tcMar>
-          </w:tcPr>
-          <w:p>
-            <w:r>
-              <w:rPr>
-                <w:b w:val="false"/>
-                <w:bCs w:val="false"/>
-                <w:sz w:val="20"/>
-                <w:szCs w:val="20"/>
-              </w:rPr>
-              <w:t xml:space="preserve">показать пинг до сервера</w:t>
-            </w:r>
-          </w:p>
-        </w:tc>
-      </w:tr>
-      <w:tr>
-        <w:trPr>
-          <w:cantSplit/>
-        </w:trPr>
-        <w:tc>
-          <w:tcPr>
-            <w:tcW w:type="dxa" w:w="3000"/>
-            <w:tcMar>
-              <w:top w:type="dxa" w:w="60"/>
-              <w:left w:type="dxa" w:w="100"/>
-              <w:bottom w:type="dxa" w:w="60"/>
-              <w:right w:type="dxa" w:w="100"/>
-            </w:tcMar>
-          </w:tcPr>
-          <w:p>
-            <w:r>
-              <w:rPr>
-                <w:b w:val="false"/>
-                <w:bCs w:val="false"/>
-                <w:sz w:val="20"/>
-                <w:szCs w:val="20"/>
-              </w:rPr>
-              <w:t xml:space="preserve">любой другой текст</w:t>
-            </w:r>
-          </w:p>
-        </w:tc>
-        <w:tc>
-          <w:tcPr>
-            <w:tcW w:type="dxa" w:w="6360"/>
-            <w:tcMar>
-              <w:top w:type="dxa" w:w="60"/>
-              <w:left w:type="dxa" w:w="100"/>
-              <w:bottom w:type="dxa" w:w="60"/>
-              <w:right w:type="dxa" w:w="100"/>
-            </w:tcMar>
-          </w:tcPr>
-          <w:p>
-            <w:r>
-              <w:rPr>
-                <w:b w:val="false"/>
-                <w:bCs w:val="false"/>
-                <w:sz w:val="20"/>
-                <w:szCs w:val="20"/>
-              </w:rPr>
-              <w:t xml:space="preserve">сообщение в чат комнаты</w:t>
-            </w:r>
-          </w:p>
-        </w:tc>
-      </w:tr>
-      <w:tr>
-        <w:trPr>
-          <w:cantSplit/>
-        </w:trPr>
-        <w:tc>
-          <w:tcPr>
-            <w:tcW w:type="dxa" w:w="3000"/>
-            <w:tcMar>
-              <w:top w:type="dxa" w:w="60"/>
-              <w:left w:type="dxa" w:w="100"/>
-              <w:bottom w:type="dxa" w:w="60"/>
-              <w:right w:type="dxa" w:w="100"/>
-            </w:tcMar>
-          </w:tcPr>
-          <w:p>
-            <w:r>
-              <w:rPr>
-                <w:b w:val="false"/>
-                <w:bCs w:val="false"/>
-                <w:sz w:val="20"/>
-                <w:szCs w:val="20"/>
-              </w:rPr>
-              <w:t xml:space="preserve">exit</w:t>
-            </w:r>
-          </w:p>
-        </w:tc>
-        <w:tc>
-          <w:tcPr>
-            <w:tcW w:type="dxa" w:w="6360"/>
-            <w:tcMar>
-              <w:top w:type="dxa" w:w="60"/>
-              <w:left w:type="dxa" w:w="100"/>
-              <w:bottom w:type="dxa" w:w="60"/>
-              <w:right w:type="dxa" w:w="100"/>
-            </w:tcMar>
-          </w:tcPr>
-          <w:p>
-            <w:r>
-              <w:rPr>
-                <w:b w:val="false"/>
-                <w:bCs w:val="false"/>
-                <w:sz w:val="20"/>
-                <w:szCs w:val="20"/>
-              </w:rPr>
-              <w:t xml:space="preserve">выход</w:t>
-            </w:r>
-          </w:p>
-        </w:tc>
-      </w:tr>
-    </w:tbl>
-    <w:p>
-      <w:pPr>
-        <w:spacing w:after="60"/>
-      </w:pPr>
+        <w:t xml:space="preserve">Экраны подключения, лобби и комнаты управляются мышью: кнопки нажимаются левой кнопкой, в поля ввода печатают с клавиатуры, Enter отправляет (вход, создание комнаты, сообщение в чат). Кнопки и поля ввода рисуются средствами Raylib-cs: прямоугольник с текстом и проверка, что клик попал внутрь.</w:t>
+      </w:r>
     </w:p>
     <w:p>
       <w:pPr>
         <w:spacing w:after="120"/>
       </w:pPr>
       <w:r>
-        <w:t xml:space="preserve">В окне раунда:</w:t>
+        <w:t xml:space="preserve">На экране игры:</w:t>
       </w:r>
     </w:p>
     <w:tbl>
@@ -7477,7 +6855,7 @@
         <w:spacing w:after="60"/>
       </w:pPr>
       <w:r>
-        <w:t xml:space="preserve">Приём датаграмм идёт в отдельной задаче и кладёт разобранные пакеты в потокобезопасную очередь. Главный поток разбирает очередь; с окном работает только он.</w:t>
+        <w:t xml:space="preserve">Окно и весь Raylib-cs работают только в главном потоке. Приём датаграмм идёт в отдельной задаче и кладёт разобранные пакеты в потокобезопасную очередь; главный поток разбирает очередь каждый кадр.</w:t>
       </w:r>
     </w:p>
     <w:p>
@@ -7503,7 +6881,7 @@
         <w:spacing w:after="60"/>
       </w:pPr>
       <w:r>
-        <w:t xml:space="preserve">Hello уходит через надёжный канал. Welcome не пришёл за 5 с — «Сервер не отвечает» и выход. SocketException 10054 обрабатывается без падения.</w:t>
+        <w:t xml:space="preserve">Hello уходит через надёжный канал. Welcome не пришёл за 5 с — «Сервер не отвечает» и возврат к вводу ника. SocketException 10054 обрабатывается без падения.</w:t>
       </w:r>
     </w:p>
     <w:p>
@@ -7529,7 +6907,7 @@
         <w:spacing w:after="60"/>
       </w:pPr>
       <w:r>
-        <w:t xml:space="preserve">Snapshot применяется, только если его tick больше последнего применённого. Snapshot вне раунда игнорируется. Интерполяция не требуется.</w:t>
+        <w:t xml:space="preserve">Snapshot применяется, только если его tick больше последнего применённого. Snapshot вне экрана игры игнорируется. Интерполяция не требуется.</w:t>
       </w:r>
     </w:p>
     <w:p>
@@ -7542,7 +6920,7 @@
         <w:spacing w:after="60"/>
       </w:pPr>
       <w:r>
-        <w:t xml:space="preserve">Нет ни одной датаграммы от сервера 5 с — показывается «Соединение потеряно», программа завершается без падения.</w:t>
+        <w:t xml:space="preserve">Нет ни одной датаграммы от сервера 5 с — показывается «Соединение потеряно» и происходит возврат на экран подключения, без падения программы.</w:t>
       </w:r>
     </w:p>
     <w:p>
@@ -7555,7 +6933,7 @@
         <w:spacing w:after="60"/>
       </w:pPr>
       <w:r>
-        <w:t xml:space="preserve">При выходе клиент шлёт 3 копии Disconnect.</w:t>
+        <w:t xml:space="preserve">При закрытии окна клиент шлёт 3 копии Disconnect.</w:t>
       </w:r>
     </w:p>
     <w:p>
@@ -8665,7 +8043,7 @@
                 <w:sz w:val="20"/>
                 <w:szCs w:val="20"/>
               </w:rPr>
-              <w:t xml:space="preserve">README: как запустить сервер и клиент, команды консоли, описание протокола из раздела 3</w:t>
+              <w:t xml:space="preserve">README: как запустить сервер и клиент, описание протокола из раздела 3</w:t>
             </w:r>
           </w:p>
         </w:tc>
@@ -9246,7 +8624,7 @@
                 <w:sz w:val="20"/>
                 <w:szCs w:val="20"/>
               </w:rPr>
-              <w:t xml:space="preserve">Raylib-cs, карта из файла, Input и Snapshot 20 раз в секунду без гарантий, отбрасывание устаревших, стены, таймер раунда</w:t>
+              <w:t xml:space="preserve">Raylib-cs: экраны подключения, лобби и комнаты; карта из файла; Input и Snapshot 20 раз в секунду без гарантий, отбрасывание устаревших, стены, таймер раунда</w:t>
             </w:r>
           </w:p>
         </w:tc>
@@ -9268,7 +8646,7 @@
                 <w:sz w:val="20"/>
                 <w:szCs w:val="20"/>
               </w:rPr>
-              <w:t xml:space="preserve">3 игрока в локальной сети видят движение друг друга без заметных рывков</w:t>
+              <w:t xml:space="preserve">всё лобби проходится мышкой; 3 игрока в локальной сети видят движение друг друга без заметных рывков</w:t>
             </w:r>
           </w:p>
         </w:tc>

</xml_diff>